<commit_message>
Fix Checkpoint 3.1: correct Q2 root-cause analysis, check completion checklist
Verified by hand: the RNA-splicing 'Aggregator' sentence required by Q2's
grading notes was already present in the retrieved abstract chunk (word
index 169, inside chunk 0's 0-249 window) for both this checkpoint and
Checkpoint 2.1. The earlier writeup incorrectly attributed the failure to
'different chunks retrieved' when in fact the correct chunk was retrieved
both times — the generated answer just didn't use it. Reclassified as a
generation-side failure, not a retrieval gap, and corrected the downstream
weaknesses/failure-modes/next-steps sections and README accordingly. Also
checked the worksheet's 5-item completion checklist, which was left blank.

Co-Authored-By: Claude Sonnet 5 <noreply@anthropic.com>
</commit_message>
<xml_diff>
--- a/Capstone Checkpoint 3.1/Required_Capstone_Checkpoint_3_1_Worksheet_completed.docx
+++ b/Capstone Checkpoint 3.1/Required_Capstone_Checkpoint_3_1_Worksheet_completed.docx
@@ -58,7 +58,7 @@
           <w:sz w:val="24"/>
           <w:szCs w:val="24"/>
         </w:rPr>
-        <w:t xml:space="preserve">☐ </w:t>
+        <w:t xml:space="preserve">☒ </w:t>
       </w:r>
       <w:r>
         <w:rPr>
@@ -94,7 +94,7 @@
           <w:sz w:val="24"/>
           <w:szCs w:val="24"/>
         </w:rPr>
-        <w:t>☐</w:t>
+        <w:t>☒</w:t>
       </w:r>
       <w:r>
         <w:rPr>
@@ -130,7 +130,7 @@
           <w:sz w:val="24"/>
           <w:szCs w:val="24"/>
         </w:rPr>
-        <w:t>☐</w:t>
+        <w:t>☒</w:t>
       </w:r>
       <w:r>
         <w:rPr>
@@ -166,7 +166,7 @@
           <w:sz w:val="24"/>
           <w:szCs w:val="24"/>
         </w:rPr>
-        <w:t>☐</w:t>
+        <w:t>☒</w:t>
       </w:r>
       <w:r>
         <w:rPr>
@@ -202,7 +202,7 @@
           <w:sz w:val="24"/>
           <w:szCs w:val="24"/>
         </w:rPr>
-        <w:t>☐</w:t>
+        <w:t>☒</w:t>
       </w:r>
       <w:r>
         <w:rPr>
@@ -238,7 +238,7 @@
           <w:sz w:val="24"/>
           <w:szCs w:val="24"/>
         </w:rPr>
-        <w:t>☐</w:t>
+        <w:t>☒</w:t>
       </w:r>
       <w:r>
         <w:rPr>
@@ -1546,7 +1546,7 @@
               <w:t>Response:</w:t>
             </w:r>
             <w:r>
-              <w:t xml:space="preserve"> Baseline pass rate: 3/5 (60%). PASS: Q1 (counterfeit conundrum, exact terminology match), Q3 (DreamCoder/Stitch compression metric, paraphrased but still anchored by shared terms), Q5 (off-corpus question — correctly abstained rather than hallucinating). FAIL: Q4 (naming both 'EC2' and 'Stitch' — retrieval never surfaced Ellis et al.'s own 2018 paper, so the model substituted the corpus's more commonly-cited term 'DreamCoder'), and — unexpectedly — Q2 (RNA splicing interpretability: retrieval found the right paper but a different phrasing of essentially the same question as Checkpoint 2.1 pulled different chunks that never mention the specific term 'Aggregator' required by my grading notes). Q2's failure was the most surprising and diagnostically useful result: it shows retrieval correctness is sensitive to exact query wording even when the right document is found.</w:t>
+              <w:t xml:space="preserve"> Baseline pass rate: 3/5 (60%). PASS: Q1 (counterfeit conundrum, exact terminology match), Q3 (DreamCoder/Stitch compression metric, paraphrased but still anchored by shared terms), Q5 (off-corpus question — correctly abstained rather than hallucinating). FAIL: Q4 (naming both 'EC2' and 'Stitch' — retrieval never surfaced Ellis et al.'s own 2018 paper, so the model substituted the corpus's more commonly-cited term 'DreamCoder'), and — unexpectedly — Q2 (RNA splicing interpretability: retrieval correctly returned the paper's abstract chunk, which verbatim contains the required sentence ('separate Motif and Aggregator components ... enforcing sparsity to improve interpretability'), but the generated answer drew instead from the other two retrieved chunks — which describe the architecture in more technical depth — and never surfaced that sentence). Q2's failure was the most surprising and diagnostically useful result: I confirmed by hand (checking word position against chunk boundaries) that the required sentence was inside the retrieved context the whole time, which means this is a generation failure to use available context, not a retrieval failure.</w:t>
             </w:r>
           </w:p>
           <w:p>
@@ -1896,7 +1896,7 @@
               <w:t>Response:</w:t>
             </w:r>
             <w:r>
-              <w:t xml:space="preserve"> Query: “What does the neural model of RNA splicing use to improve interpretability?” Retrieved: Gupta2024 chunks 0, 6, 3 (correct paper). Output: accurately describes the paper's “Sparse Adjusted Motif (SAM)”, “Local Splice Site Identifier (LSSI)”, and “Fixed Motif (FM)” components — but never uses the word “Aggregator”, which my grading notes required. Result: FAIL. This was unplanned: Checkpoint 2.1's similarly-worded query on the same paper retrieved different chunks that did discuss an Aggregator component. The right document was found both times, but different phrasing pulled different chunks of it, and only one phrasing's chunks happened to contain the exact terminology my grading notes expected.</w:t>
+              <w:t xml:space="preserve"> Query: “What does the neural model of RNA splicing use to improve interpretability?” Retrieved: Gupta2024 chunks 0, 6, 3 (correct paper). Output: accurately describes the paper's “Sparse Adjusted Motif (SAM)”, “Local Splice Site Identifier (LSSI)”, and “Fixed Motif (FM)” components — but never uses the word “Aggregator”, which my grading notes required. Result: FAIL. I double-checked this by hand: chunk 0 is the paper's abstract, and it verbatim contains “separate Motif and Aggregator components that can be mixed and matched, enforcing sparsity to improve interpretability” — the exact sentence my grading notes needed. So the required fact WAS in the model's context; the model simply didn't use it, choosing instead to synthesize an answer from chunks 6 and 3 (later, more technical sections about LSSI/SAM/FM). This is a real generation-side failure — correct retrieval, incomplete use of it — not a retrieval gap.</w:t>
             </w:r>
           </w:p>
           <w:p>
@@ -2172,7 +2172,7 @@
               <w:t>Response:</w:t>
             </w:r>
             <w:r>
-              <w:t xml:space="preserve"> Retrieval is sensitive to exact query phrasing: two reasonable, semantically-equivalent ways of asking about the same paper (Q2 here vs. Checkpoint 2.1's version) can retrieve different chunks of that paper, changing whether a specific expected fact ends up in context at all. The system also cannot reliably distinguish a topic's primary source paper from a secondary paper that merely discusses it heavily (Q4: Bowers et al.'s paper out-ranked Ellis et al.'s own paper for a query specifically about Ellis et al.'s work).</w:t>
+              <w:t xml:space="preserve"> Two distinct weaknesses, one in each half of the pipeline. Retrieval weakness (Q4): the system cannot reliably distinguish a topic's primary source paper from a secondary paper that merely discusses it heavily — Bowers et al.'s paper out-ranked Ellis et al.'s own paper (by a wide margin: I confirmed Ellis et al.'s best-scoring chunk ranked 122nd overall for this query) for a question specifically about Ellis et al.'s work. Generation weakness (Q2): even when retrieval returns the exact chunk containing the required fact, the model can still write an answer that omits it in favor of other retrieved material — retrieval success does not guarantee the generated answer uses everything it was given.</w:t>
             </w:r>
           </w:p>
           <w:p>
@@ -2268,7 +2268,7 @@
               <w:t>Response:</w:t>
             </w:r>
             <w:r>
-              <w:t xml:space="preserve"> Both failures trace to BM25's pure term-frequency ranking having no notion of source authority or query paraphrase-robustness: (1) chunking is fixed and phrasing-sensitive — a ~250-word window either does or doesn't happen to contain a given term, and slightly different query wording retrieves a different window (Q2); (2) a paper that discusses a topic extensively as background (Bowers et al. citing DreamCoder many times) can out-score the topic's own, shorter primary source (Ellis et al.'s 2018 paper) purely on keyword density (Q4). Both connect directly to the evidence in Step 4: identical underlying facts, different chunk sets retrieved, different pass/fail outcomes.</w:t>
+              <w:t xml:space="preserve"> Q4 traces to BM25's pure term-frequency ranking having no notion of source authority: a paper that discusses a topic extensively as background (Bowers et al. citing DreamCoder dozens of times) can out-score the topic's own, shorter primary source (Ellis et al.'s 2018 paper) purely on keyword density. Q2 traces to something different: with 3 retrieved chunks covering related-but-distinct architectural details, the model apparently prioritized the more detailed, later chunks over the concise abstract sentence that actually answered the grading notes — a selective-attention/synthesis issue on the generation side, independent of retrieval quality. Both connect to the evidence in Step 4, but they are different failure classes and would need different fixes (better ranking vs. better prompting/synthesis).</w:t>
             </w:r>
           </w:p>
           <w:p>
@@ -3140,7 +3140,7 @@
               <w:t>Response:</w:t>
             </w:r>
             <w:r>
-              <w:t xml:space="preserve"> Next: (1) expand the eval set and add a 'partial' verdict tier instead of strict pass/fail; (2) test the judge against subtler manipulated answers (right paper, wrong quote/number) to stress-test it the way Checkpoint 1.1's hallucinations actually looked; (3) use a different, stronger model as judge than the generator to reduce shared blind spots; (4) score retrieval quality independently of answer quality (was the right document in the top-k?) so failures can be attributed precisely; (5) address the Q2/Q4 findings directly by moving to hybrid (BM25 + semantic) retrieval in Checkpoint 4.1, which should be more robust to paraphrasing and better at ranking a primary source over a paper that merely cites it.</w:t>
+              <w:t xml:space="preserve"> Next: (1) expand the eval set and add a 'partial' verdict tier instead of strict pass/fail; (2) test the judge against subtler manipulated answers (right paper, wrong quote/number) to stress-test it the way Checkpoint 1.1's hallucinations actually looked; (3) use a different, stronger model as judge than the generator to reduce shared blind spots; (4) score retrieval quality independently of answer quality (was the right chunk in the top-k?) so failures can be attributed precisely — this checkpoint's Q2 finding only came from manually checking chunk boundaries, which should be automated; (5) address Q4's retrieval gap by moving to hybrid (BM25 + semantic) retrieval in Checkpoint 4.1, which should better rank a primary source over a paper that merely cites it; (6) separately address Q2's generation gap — which hybrid retrieval would NOT fix, since the right chunk was already retrieved — by testing prompting changes (e.g. asking the model to check each retrieved chunk individually against the question) rather than assuming better retrieval solves every failure.</w:t>
             </w:r>
           </w:p>
           <w:p>

</xml_diff>